<commit_message>
Updated feature prototype and design and evaluation sections
</commit_message>
<xml_diff>
--- a/preliminary report/Brief and Rubric.docx
+++ b/preliminary report/Brief and Rubric.docx
@@ -36,11 +36,9 @@
       <w:r>
         <w:t xml:space="preserve">In this staff graded assignment you are to submit a preliminary draft of some aspects of your project report. The report must consist of four </w:t>
       </w:r>
-      <w:proofErr w:type="gramStart"/>
-      <w:r>
-        <w:t>chapters, and</w:t>
-      </w:r>
-      <w:proofErr w:type="gramEnd"/>
+      <w:r>
+        <w:t>chapters and</w:t>
+      </w:r>
       <w:r>
         <w:t xml:space="preserve"> have a total maximum word limit of 6000 words (excluding title page, reference list, etc). The chapters required are:</w:t>
       </w:r>
@@ -129,31 +127,7 @@
     </w:p>
     <w:p>
       <w:r>
-        <w:t xml:space="preserve">The per-chapter maximums are strict, as is the overall word count. Note that the total of the </w:t>
-      </w:r>
-      <w:proofErr w:type="gramStart"/>
-      <w:r>
-        <w:t>four chapter</w:t>
-      </w:r>
-      <w:proofErr w:type="gramEnd"/>
-      <w:r>
-        <w:t xml:space="preserve"> word counts is 7000 --- this is not an </w:t>
-      </w:r>
-      <w:proofErr w:type="gramStart"/>
-      <w:r>
-        <w:t>error</w:t>
-      </w:r>
-      <w:proofErr w:type="gramEnd"/>
-      <w:r>
-        <w:t xml:space="preserve"> but it allows you flexibility in the lengths of each </w:t>
-      </w:r>
-      <w:proofErr w:type="gramStart"/>
-      <w:r>
-        <w:t>chapter, and</w:t>
-      </w:r>
-      <w:proofErr w:type="gramEnd"/>
-      <w:r>
-        <w:t xml:space="preserve"> lets you balance the document to some extent.</w:t>
+        <w:t>The per-chapter maximums are strict, as is the overall word count. Note that the total of the four chapter word counts is 7000 --- this is not an error but it allows you flexibility in the lengths of each chapter, and lets you balance the document to some extent.</w:t>
       </w:r>
     </w:p>
     <w:p>
@@ -178,44 +152,12 @@
     </w:p>
     <w:p>
       <w:r>
-        <w:t xml:space="preserve">You should describe the prototype in the final chapter of your preliminary report, together with an evaluation of how well you think the prototype works and how you would improve it. This evaluation should be according to appropriate approaches in the </w:t>
-      </w:r>
-      <w:proofErr w:type="gramStart"/>
-      <w:r>
-        <w:t>particular area</w:t>
-      </w:r>
-      <w:proofErr w:type="gramEnd"/>
-      <w:r>
-        <w:t xml:space="preserve"> you are working in --- for example, evaluation in the Machine Learning area may not be appropriate in the Web Development area. The evaluation you use must be appropriate for your </w:t>
-      </w:r>
-      <w:proofErr w:type="gramStart"/>
-      <w:r>
-        <w:t>particular project</w:t>
-      </w:r>
-      <w:proofErr w:type="gramEnd"/>
-      <w:r>
-        <w:t xml:space="preserve">. It is even better if you </w:t>
-      </w:r>
-      <w:proofErr w:type="gramStart"/>
-      <w:r>
-        <w:t>are able to</w:t>
-      </w:r>
-      <w:proofErr w:type="gramEnd"/>
-      <w:r>
-        <w:t xml:space="preserve"> link your chosen evaluation approach to related background work.</w:t>
-      </w:r>
-    </w:p>
-    <w:p>
-      <w:r>
-        <w:t xml:space="preserve">You must also submit a </w:t>
-      </w:r>
-      <w:proofErr w:type="gramStart"/>
-      <w:r>
-        <w:t>3-5 minute</w:t>
-      </w:r>
-      <w:proofErr w:type="gramEnd"/>
-      <w:r>
-        <w:t xml:space="preserve"> video that demonstrates the prototype together with any motivation and discussion that you feel is appropriate. Your video format </w:t>
+        <w:t>You should describe the prototype in the final chapter of your preliminary report, together with an evaluation of how well you think the prototype works and how you would improve it. This evaluation should be according to appropriate approaches in the particular area you are working in --- for example, evaluation in the Machine Learning area may not be appropriate in the Web Development area. The evaluation you use must be appropriate for your particular project. It is even better if you are able to link your chosen evaluation approach to related background work.</w:t>
+      </w:r>
+    </w:p>
+    <w:p>
+      <w:r>
+        <w:t xml:space="preserve">You must also submit a 3-5 minute video that demonstrates the prototype together with any motivation and discussion that you feel is appropriate. Your video format </w:t>
       </w:r>
       <w:r>
         <w:rPr>
@@ -1300,6 +1242,7 @@
   <w:style w:type="character" w:default="1" w:styleId="DefaultParagraphFont">
     <w:name w:val="Default Paragraph Font"/>
     <w:uiPriority w:val="1"/>
+    <w:semiHidden/>
     <w:unhideWhenUsed/>
   </w:style>
   <w:style w:type="table" w:default="1" w:styleId="TableNormal">

</xml_diff>